<commit_message>
chore(content): Updates in content
</commit_message>
<xml_diff>
--- a/SPA/my-app/public/resume/Rajkishor_Maharana_Resume.docx
+++ b/SPA/my-app/public/resume/Rajkishor_Maharana_Resume.docx
@@ -253,7 +253,15 @@
             </w:pPr>
             <w:r>
               <w:rPr/>
-              <w:t>Inventive Front-End developer with 5 years of broad expertise in UI/UX &amp; Design, JavaScript areas with willingness to learn and master backend-end development and web server’s administrator. Testing, DDD/TDD expert.</w:t>
+              <w:t>Inventive Front-End developer with 5.</w:t>
+            </w:r>
+            <w:r>
+              <w:rPr/>
+              <w:t>5</w:t>
+            </w:r>
+            <w:r>
+              <w:rPr/>
+              <w:t xml:space="preserve"> years of broad expertise in UI/UX &amp; Design, JavaScript areas with willingness to learn and master backend development and web server’s administrator. Testing, DDD/TDD expert.</w:t>
             </w:r>
           </w:p>
           <w:p>
@@ -374,11 +382,12 @@
                 <w:rPr>
                   <w:rStyle w:val="InternetLink"/>
                 </w:rPr>
-                <w:t>https://raj-kishore.github.io/</w:t>
+                <w:t>https://www.linkedin.com/in/rajkishor-maharana-773b0a290/</w:t>
               </w:r>
             </w:hyperlink>
             <w:r>
               <w:rPr/>
+              <w:t xml:space="preserve"> </w:t>
               <w:br/>
               <w:t xml:space="preserve">Hyderabad, IN </w:t>
             </w:r>
@@ -1219,18 +1228,60 @@
                 <w:b/>
                 <w:bCs/>
               </w:rPr>
-              <w:t>DevOps</w:t>
-            </w:r>
-          </w:p>
-          <w:p>
-            <w:pPr>
-              <w:pStyle w:val="Normal"/>
-              <w:widowControl w:val="false"/>
-              <w:rPr/>
-            </w:pPr>
-            <w:r>
-              <w:rPr/>
-              <w:t>Docker, Jenkins, Azure DevOps</w:t>
+              <w:t>CI/CD</w:t>
+            </w:r>
+          </w:p>
+          <w:p>
+            <w:pPr>
+              <w:pStyle w:val="Normal"/>
+              <w:widowControl w:val="false"/>
+              <w:rPr/>
+            </w:pPr>
+            <w:r>
+              <w:rPr/>
+              <w:t xml:space="preserve">Docker, Jenkins, Azure DevOps, </w:t>
+            </w:r>
+            <w:r>
+              <w:rPr/>
+              <w:t>Bitbucket</w:t>
+            </w:r>
+          </w:p>
+          <w:p>
+            <w:pPr>
+              <w:pStyle w:val="Normal"/>
+              <w:widowControl w:val="false"/>
+              <w:rPr/>
+            </w:pPr>
+            <w:r>
+              <w:rPr/>
+            </w:r>
+          </w:p>
+          <w:p>
+            <w:pPr>
+              <w:pStyle w:val="Normal"/>
+              <w:widowControl w:val="false"/>
+              <w:rPr>
+                <w:b/>
+                <w:bCs/>
+              </w:rPr>
+            </w:pPr>
+            <w:r>
+              <w:rPr>
+                <w:b/>
+                <w:bCs/>
+              </w:rPr>
+              <w:t xml:space="preserve">Back End </w:t>
+            </w:r>
+          </w:p>
+          <w:p>
+            <w:pPr>
+              <w:pStyle w:val="Normal"/>
+              <w:widowControl w:val="false"/>
+              <w:rPr/>
+            </w:pPr>
+            <w:r>
+              <w:rPr/>
+              <w:t>AWS</w:t>
             </w:r>
           </w:p>
           <w:p>

</xml_diff>